<commit_message>
Add configurable memo workflow settings
</commit_message>
<xml_diff>
--- a/template_travel_schedule.docx
+++ b/template_travel_schedule.docx
@@ -403,16 +403,6 @@
           <w:szCs w:val="32"/>
         </w:rPr>
         <w:t xml:space="preserve"> </w:t>
-      </w:r>
-      <w:r>
-        <w:rPr>
-          <w:rFonts w:ascii="TH SarabunPSK" w:hAnsi="TH SarabunPSK" w:cs="TH SarabunPSK" w:hint="cs"/>
-          <w:color w:val="000000"/>
-          <w:sz w:val="32"/>
-          <w:szCs w:val="32"/>
-          <w:cs/>
-        </w:rPr>
-        <w:t>จังหวัด</w:t>
       </w:r>
       <w:r>
         <w:rPr>

</xml_diff>